<commit_message>
Add type-checking density test and docs fixes
Add a new architecture test (tests/architecture/test_type_checking_density.py) to track and limit TYPE_CHECKING import density in reviewed hotspot zones. Update the observability interface to expose start_metrics_server via the composition runtime entrypoint and adjust the corresponding unit test to reflect the new re-export location. Minor docs updates: mark refactor prompt canonical/deprecated, change governance run commands to use `uv run`, correct a test filename reference in REQUIREMENTS.md, update binary MMD diagram files, and remove a legacy docs/svg/INDEX.md placeholder.
</commit_message>
<xml_diff>
--- a/docs/02-architecture/mmd-diagrams/foundation-diagrams-with-descriptions.docx
+++ b/docs/02-architecture/mmd-diagrams/foundation-diagrams-with-descriptions.docx
@@ -1434,7 +1434,7 @@
         <w:pStyle w:val="FirstParagraph"/>
       </w:pPr>
       <w:r>
-        <w:t xml:space="preserve">Диаграмма Title: Pipeline Execution — Happy Path из foundation-набора фиксирует устойчивый архитектурный или процессный паттерн проекта BioETL. Она представлена в формате sequenceDiagram и служит базовым ориентиром для инженерного анализа, ревью изменений и обсуждения технических решений. Уровень детализации обозначен как Mixed (System / Component / Class), поэтому схема подходит одновременно для быстрой навигации по контексту и для проверки корректности зависимостей, контрактов и потоков обработки данных в рамках сценария 03-pipeline-execution-happy-path. В комментариях исходника зафиксирован фокус диаграммы: Covers: RULES.md §3 (Pipeline Execution), §3.3 (Locking), §3.4 (Postrun). Это снижает неоднозначность интерпретации и помогает поддерживать консистентность между визуальной документацией, ADR-решениями и реальным кодом. Значимые участники последовательностей: CLI, bootstrap_pipeline(), PipelineRunner, LockManager, PreflightService. По этим участникам удобно валидировать порядок вызовов, точки отказа и стратегию обработки ошибок. Дополнительно в метаданных указан показатель плотности (@nodes=n/a), что полезно при контроле читаемости и планировании декомпозиции диаграмм на более узкие представления.</w:t>
+        <w:t xml:space="preserve">Диаграмма Title: Pipeline Execution — Happy Path из foundation-набора фиксирует устойчивый архитектурный или процессный паттерн проекта BioETL. Она представлена в формате sequenceDiagram и служит базовым ориентиром для инженерного анализа, ревью изменений и обсуждения технических решений. Уровень детализации обозначен как Mixed (System / Component / Class), поэтому схема подходит одновременно для быстрой навигации по контексту и для проверки корректности зависимостей, контрактов и потоков обработки данных в рамках сценария 03-pipeline-execution-happy-path. В комментариях исходника зафиксирован фокус диаграммы: Covers: RULES.md §3 (Pipeline Execution), §3.3 (Locking), §3.4 (Postrun). Это снижает неоднозначность интерпретации и помогает поддерживать консистентность между визуальной документацией, ADR-решениями и реальным кодом. Значимые участники последовательностей: CLI, bootstrap_pipeline(), PipelineRunner, LockCoordinator, PreflightService. По этим участникам удобно валидировать порядок вызовов, точки отказа и стратегию обработки ошибок. Дополнительно в метаданных указан показатель плотности (@nodes=n/a), что полезно при контроле читаемости и планировании декомпозиции диаграмм на более узкие представления.</w:t>
       </w:r>
     </w:p>
     <w:bookmarkEnd w:id="20"/>
@@ -7093,7 +7093,7 @@
         <w:pStyle w:val="FirstParagraph"/>
       </w:pPr>
       <w:r>
-        <w:t xml:space="preserve">Диаграмма Title: Application Core Component Collaboration из foundation-набора фиксирует устойчивый архитектурный или процессный паттерн проекта BioETL. Она представлена в формате flowchart и служит базовым ориентиром для инженерного анализа, ревью изменений и обсуждения технических решений. Уровень детализации обозначен как Mixed (System / Component / Class), поэтому схема подходит одновременно для быстрой навигации по контексту и для проверки корректности зависимостей, контрактов и потоков обработки данных в рамках сценария 40-application-core-collaboration. В комментариях исходника зафиксирован фокус диаграммы: Covers: RULES.md §1.1 (Application Layer), application/core/. Это снижает неоднозначность интерпретации и помогает поддерживать консистентность между визуальной документацией, ADR-решениями и реальным кодом. Ключевые блоки/подграфы включают: PipelineRunner (application/core/runner.py), Lifecycle Services, Pre/Post Services, Batch Execution, Observability. Их состав отражает главные границы ответственности и маршруты взаимодействия между подсистемами или слоями. Показательные узлы диаграммы: PipelineRunner (application/core/runner.py), run() — main orchestrator, Lifecycle Services, LockManager • acquire(key, owner, ttl=90s) • release(key, owner) • validate_ownership(), HeartbeatService • start() • stop(), CheckpointManager • read_checkpoint() • save_checkpoint(). Они позволяют быстро сопоставлять термины, роли сервисов и артефакты данных между моделью и реализацией. Дополнительно в метаданных указан показатель плотности (@nodes=n/a), что полезно при контроле читаемости и планировании декомпозиции диаграмм на более узкие представления.</w:t>
+        <w:t xml:space="preserve">Диаграмма Title: Application Core Component Collaboration из foundation-набора фиксирует устойчивый архитектурный или процессный паттерн проекта BioETL. Она представлена в формате flowchart и служит базовым ориентиром для инженерного анализа, ревью изменений и обсуждения технических решений. Уровень детализации обозначен как Mixed (System / Component / Class), поэтому схема подходит одновременно для быстрой навигации по контексту и для проверки корректности зависимостей, контрактов и потоков обработки данных в рамках сценария 40-application-core-collaboration. В комментариях исходника зафиксирован фокус диаграммы: Covers: RULES.md §1.1 (Application Layer), application/core/. Это снижает неоднозначность интерпретации и помогает поддерживать консистентность между визуальной документацией, ADR-решениями и реальным кодом. Ключевые блоки/подграфы включают: PipelineRunner (application/core/runner.py), Lifecycle Services, Pre/Post Services, Batch Execution, Observability. Их состав отражает главные границы ответственности и маршруты взаимодействия между подсистемами или слоями. Показательные узлы диаграммы: PipelineRunner (application/core/runner.py), run() — main orchestrator, Lifecycle Services, LockCoordinator • acquire(key, owner, ttl=90s) • release(key, owner) • validate_ownership(), HeartbeatService • start() • stop(), CheckpointManager • read_checkpoint() • save_checkpoint(). Они позволяют быстро сопоставлять термины, роли сервисов и артефакты данных между моделью и реализацией. Дополнительно в метаданных указан показатель плотности (@nodes=n/a), что полезно при контроле читаемости и планировании декомпозиции диаграмм на более узкие представления.</w:t>
       </w:r>
     </w:p>
     <w:bookmarkEnd w:id="143"/>

</xml_diff>